<commit_message>
main api, a streamlit frontend is added
</commit_message>
<xml_diff>
--- a/RETRIVAL AUGMENTED GENERATION.docx
+++ b/RETRIVAL AUGMENTED GENERATION.docx
@@ -43,7 +43,13 @@
     </w:p>
     <w:p>
       <w:r>
-        <w:t xml:space="preserve">THERE IS A MATH IN ENGLISH SAYING WITH 5-6 CHARACTERS WE CAN BUILD A SMALL WORD, WITH 11- 12 CHAR WE CAN BUILD AN AVERAGE LENGTH WORD, SO WHEN A CHUNK HAS 500 </w:t>
+        <w:t>THERE IS A MATH IN ENGLISH SAYING</w:t>
+      </w:r>
+      <w:r>
+        <w:t>,</w:t>
+      </w:r>
+      <w:r>
+        <w:t xml:space="preserve"> WITH 5-6 CHARACTERS WE CAN BUILD A SMALL WORD, WITH 11- 12 CHAR WE CAN BUILD AN AVERAGE LENGTH WORD, SO WHEN A CHUNK HAS 500 </w:t>
       </w:r>
       <w:proofErr w:type="gramStart"/>
       <w:r>
@@ -66,18 +72,12 @@
     </w:p>
     <w:p>
       <w:r>
-        <w:t xml:space="preserve">NEWS ARTICLE= 400 TO 600 </w:t>
-      </w:r>
-      <w:r>
-        <w:t>CHARS PER CHUNK</w:t>
-      </w:r>
-    </w:p>
-    <w:p>
-      <w:r>
-        <w:t xml:space="preserve">BOOKS AND MANUALS= 500 TO 800 </w:t>
-      </w:r>
-      <w:r>
-        <w:t>CHARS PER CHUNK</w:t>
+        <w:t>NEWS ARTICLE= 400 TO 600 CHARS PER CHUNK</w:t>
+      </w:r>
+    </w:p>
+    <w:p>
+      <w:r>
+        <w:t>BOOKS AND MANUALS= 500 TO 800 CHARS PER CHUNK</w:t>
       </w:r>
     </w:p>
     <w:p>
@@ -272,194 +272,177 @@
           <w:bCs/>
           <w:color w:val="EE0000"/>
         </w:rPr>
-        <w:t>7️</w:t>
-      </w:r>
-      <w:r>
-        <w:rPr>
-          <w:rFonts w:ascii="Segoe UI Symbol" w:hAnsi="Segoe UI Symbol" w:cs="Segoe UI Symbol"/>
+        <w:t>What Actually Determines Parameter Count</w:t>
+      </w:r>
+    </w:p>
+    <w:p>
+      <w:pPr>
+        <w:rPr>
+          <w:color w:val="EE0000"/>
+        </w:rPr>
+      </w:pPr>
+      <w:r>
+        <w:rPr>
+          <w:color w:val="EE0000"/>
+        </w:rPr>
+        <w:t>Main variables:</w:t>
+      </w:r>
+    </w:p>
+    <w:p>
+      <w:pPr>
+        <w:rPr>
+          <w:color w:val="EE0000"/>
+        </w:rPr>
+      </w:pPr>
+      <w:proofErr w:type="spellStart"/>
+      <w:r>
+        <w:rPr>
+          <w:color w:val="EE0000"/>
+        </w:rPr>
+        <w:t>vocabulary_size</w:t>
+      </w:r>
+      <w:proofErr w:type="spellEnd"/>
+      <w:r>
+        <w:rPr>
+          <w:color w:val="EE0000"/>
+        </w:rPr>
+        <w:br/>
+      </w:r>
+      <w:proofErr w:type="spellStart"/>
+      <w:r>
+        <w:rPr>
+          <w:color w:val="EE0000"/>
+        </w:rPr>
+        <w:t>embedding_dimension</w:t>
+      </w:r>
+      <w:proofErr w:type="spellEnd"/>
+      <w:r>
+        <w:rPr>
+          <w:color w:val="EE0000"/>
+        </w:rPr>
+        <w:br/>
+      </w:r>
+      <w:proofErr w:type="spellStart"/>
+      <w:r>
+        <w:rPr>
+          <w:color w:val="EE0000"/>
+        </w:rPr>
+        <w:lastRenderedPageBreak/>
+        <w:t>hidden_dimension</w:t>
+      </w:r>
+      <w:proofErr w:type="spellEnd"/>
+      <w:r>
+        <w:rPr>
+          <w:color w:val="EE0000"/>
+        </w:rPr>
+        <w:br/>
+      </w:r>
+      <w:proofErr w:type="spellStart"/>
+      <w:r>
+        <w:rPr>
+          <w:color w:val="EE0000"/>
+        </w:rPr>
+        <w:t>feedforward_dimension</w:t>
+      </w:r>
+      <w:proofErr w:type="spellEnd"/>
+      <w:r>
+        <w:rPr>
+          <w:color w:val="EE0000"/>
+        </w:rPr>
+        <w:br/>
+      </w:r>
+      <w:proofErr w:type="spellStart"/>
+      <w:r>
+        <w:rPr>
+          <w:color w:val="EE0000"/>
+        </w:rPr>
+        <w:t>number_of_layers</w:t>
+      </w:r>
+      <w:proofErr w:type="spellEnd"/>
+    </w:p>
+    <w:p>
+      <w:pPr>
+        <w:rPr>
+          <w:color w:val="EE0000"/>
+        </w:rPr>
+      </w:pPr>
+    </w:p>
+    <w:p>
+      <w:pPr>
+        <w:rPr>
           <w:b/>
           <w:bCs/>
-          <w:color w:val="EE0000"/>
-        </w:rPr>
-        <w:t>⃣</w:t>
-      </w:r>
+          <w:color w:val="000000" w:themeColor="text1"/>
+        </w:rPr>
+      </w:pPr>
       <w:r>
         <w:rPr>
           <w:b/>
           <w:bCs/>
-          <w:color w:val="EE0000"/>
-        </w:rPr>
-        <w:t xml:space="preserve"> What Actually Determines Parameter Count</w:t>
-      </w:r>
-    </w:p>
-    <w:p>
-      <w:pPr>
-        <w:rPr>
-          <w:color w:val="EE0000"/>
-        </w:rPr>
-      </w:pPr>
-      <w:r>
-        <w:rPr>
-          <w:color w:val="EE0000"/>
-        </w:rPr>
-        <w:t>Main variables:</w:t>
-      </w:r>
-    </w:p>
-    <w:p>
-      <w:pPr>
-        <w:rPr>
-          <w:color w:val="EE0000"/>
-        </w:rPr>
-      </w:pPr>
-      <w:proofErr w:type="spellStart"/>
-      <w:r>
-        <w:rPr>
-          <w:color w:val="EE0000"/>
-        </w:rPr>
-        <w:t>vocabulary_size</w:t>
-      </w:r>
-      <w:proofErr w:type="spellEnd"/>
-      <w:r>
-        <w:rPr>
-          <w:color w:val="EE0000"/>
-        </w:rPr>
-        <w:br/>
-      </w:r>
-      <w:proofErr w:type="spellStart"/>
-      <w:r>
-        <w:rPr>
-          <w:color w:val="EE0000"/>
-        </w:rPr>
-        <w:t>embedding_dimension</w:t>
-      </w:r>
-      <w:proofErr w:type="spellEnd"/>
-      <w:r>
-        <w:rPr>
-          <w:color w:val="EE0000"/>
-        </w:rPr>
-        <w:br/>
-      </w:r>
-      <w:proofErr w:type="spellStart"/>
-      <w:r>
-        <w:rPr>
-          <w:color w:val="EE0000"/>
-        </w:rPr>
-        <w:lastRenderedPageBreak/>
-        <w:t>hidden_dimension</w:t>
-      </w:r>
-      <w:proofErr w:type="spellEnd"/>
-      <w:r>
-        <w:rPr>
-          <w:color w:val="EE0000"/>
-        </w:rPr>
-        <w:br/>
-      </w:r>
-      <w:proofErr w:type="spellStart"/>
-      <w:r>
-        <w:rPr>
-          <w:color w:val="EE0000"/>
-        </w:rPr>
-        <w:t>feedforward_dimension</w:t>
-      </w:r>
-      <w:proofErr w:type="spellEnd"/>
-      <w:r>
-        <w:rPr>
-          <w:color w:val="EE0000"/>
-        </w:rPr>
-        <w:br/>
-      </w:r>
-      <w:proofErr w:type="spellStart"/>
-      <w:r>
-        <w:rPr>
-          <w:color w:val="EE0000"/>
-        </w:rPr>
-        <w:t>number_of_layers</w:t>
-      </w:r>
-      <w:proofErr w:type="spellEnd"/>
-    </w:p>
-    <w:p>
-      <w:pPr>
-        <w:rPr>
-          <w:color w:val="EE0000"/>
-        </w:rPr>
-      </w:pPr>
-    </w:p>
-    <w:p>
-      <w:pPr>
+          <w:color w:val="000000" w:themeColor="text1"/>
+        </w:rPr>
+        <w:t>1. What a RAG System Actually Is (Simple Concept)</w:t>
+      </w:r>
+    </w:p>
+    <w:p>
+      <w:pPr>
+        <w:rPr>
+          <w:color w:val="000000" w:themeColor="text1"/>
+        </w:rPr>
+      </w:pPr>
+      <w:r>
         <w:rPr>
           <w:b/>
           <w:bCs/>
           <w:color w:val="000000" w:themeColor="text1"/>
         </w:rPr>
-      </w:pPr>
+        <w:t>RAG = Retrieval Augmented Generation</w:t>
+      </w:r>
+    </w:p>
+    <w:p>
+      <w:pPr>
+        <w:rPr>
+          <w:color w:val="000000" w:themeColor="text1"/>
+        </w:rPr>
+      </w:pPr>
+      <w:r>
+        <w:rPr>
+          <w:color w:val="000000" w:themeColor="text1"/>
+        </w:rPr>
+        <w:t>Instead of asking an LLM directly:</w:t>
+      </w:r>
+    </w:p>
+    <w:p>
+      <w:pPr>
+        <w:rPr>
+          <w:color w:val="000000" w:themeColor="text1"/>
+        </w:rPr>
+      </w:pPr>
+      <w:r>
+        <w:rPr>
+          <w:color w:val="000000" w:themeColor="text1"/>
+        </w:rPr>
+        <w:t>User Question → LLM → Answer</w:t>
+      </w:r>
+    </w:p>
+    <w:p>
+      <w:pPr>
+        <w:rPr>
+          <w:color w:val="000000" w:themeColor="text1"/>
+        </w:rPr>
+      </w:pPr>
+      <w:r>
+        <w:rPr>
+          <w:color w:val="000000" w:themeColor="text1"/>
+        </w:rPr>
+        <w:t xml:space="preserve">RAG first </w:t>
+      </w:r>
       <w:r>
         <w:rPr>
           <w:b/>
           <w:bCs/>
           <w:color w:val="000000" w:themeColor="text1"/>
         </w:rPr>
-        <w:t>1. What a RAG System Actually Is (Simple Concept)</w:t>
-      </w:r>
-    </w:p>
-    <w:p>
-      <w:pPr>
-        <w:rPr>
-          <w:color w:val="000000" w:themeColor="text1"/>
-        </w:rPr>
-      </w:pPr>
-      <w:r>
-        <w:rPr>
-          <w:b/>
-          <w:bCs/>
-          <w:color w:val="000000" w:themeColor="text1"/>
-        </w:rPr>
-        <w:t>RAG = Retrieval Augmented Generation</w:t>
-      </w:r>
-    </w:p>
-    <w:p>
-      <w:pPr>
-        <w:rPr>
-          <w:color w:val="000000" w:themeColor="text1"/>
-        </w:rPr>
-      </w:pPr>
-      <w:r>
-        <w:rPr>
-          <w:color w:val="000000" w:themeColor="text1"/>
-        </w:rPr>
-        <w:t>Instead of asking an LLM directly:</w:t>
-      </w:r>
-    </w:p>
-    <w:p>
-      <w:pPr>
-        <w:rPr>
-          <w:color w:val="000000" w:themeColor="text1"/>
-        </w:rPr>
-      </w:pPr>
-      <w:r>
-        <w:rPr>
-          <w:color w:val="000000" w:themeColor="text1"/>
-        </w:rPr>
-        <w:t>User Question → LLM → Answer</w:t>
-      </w:r>
-    </w:p>
-    <w:p>
-      <w:pPr>
-        <w:rPr>
-          <w:color w:val="000000" w:themeColor="text1"/>
-        </w:rPr>
-      </w:pPr>
-      <w:r>
-        <w:rPr>
-          <w:color w:val="000000" w:themeColor="text1"/>
-        </w:rPr>
-        <w:t xml:space="preserve">RAG first </w:t>
-      </w:r>
-      <w:r>
-        <w:rPr>
-          <w:b/>
-          <w:bCs/>
-          <w:color w:val="000000" w:themeColor="text1"/>
-        </w:rPr>
         <w:t>retrieves relevant knowledge</w:t>
       </w:r>
       <w:r>
@@ -494,6 +477,12 @@
         </w:rPr>
         <w:br/>
         <w:t>Convert to embedding</w:t>
+      </w:r>
+      <w:r>
+        <w:rPr>
+          <w:color w:val="000000" w:themeColor="text1"/>
+        </w:rPr>
+        <w:t>+</w:t>
       </w:r>
       <w:r>
         <w:rPr>
@@ -2657,6 +2646,7 @@
   <w:style w:type="character" w:default="1" w:styleId="DefaultParagraphFont">
     <w:name w:val="Default Paragraph Font"/>
     <w:uiPriority w:val="1"/>
+    <w:semiHidden/>
     <w:unhideWhenUsed/>
   </w:style>
   <w:style w:type="table" w:default="1" w:styleId="TableNormal">

</xml_diff>